<commit_message>
Documents ISO : note 'Comment utiliser ce document' ajoutee (report depuis le monorepo)
Co-Authored-By: Claude Opus 4.8 <noreply@anthropic.com>
</commit_message>
<xml_diff>
--- a/public/iso/AI-06-Audit-interne.docx
+++ b/public/iso/AI-06-Audit-interne.docx
@@ -74,6 +74,76 @@
       </w:pPr>
       <w:r>
         <w:t xml:space="preserve">Statut : procédure à valider + premier plan</w:t>
+      </w:r>
+    </w:p>
+    <w:p>
+      <w:pPr>
+        <w:pStyle w:val="Heading2"/>
+        <w:spacing w:after="60" w:before="160"/>
+      </w:pPr>
+      <w:r>
+        <w:t xml:space="preserve">Comment utiliser ce document</w:t>
+      </w:r>
+    </w:p>
+    <w:p>
+      <w:pPr>
+        <w:spacing w:after="120"/>
+      </w:pPr>
+      <w:r>
+        <w:t xml:space="preserve">C'est le contrôle interne planifié qui vérifie que tout fonctionne réellement, pas seulement sur le papier.</w:t>
+      </w:r>
+    </w:p>
+    <w:p>
+      <w:pPr>
+        <w:spacing w:after="120"/>
+      </w:pPr>
+      <w:r>
+        <w:rPr>
+          <w:b/>
+          <w:bCs/>
+        </w:rPr>
+        <w:t xml:space="preserve">À faire :</w:t>
+      </w:r>
+    </w:p>
+    <w:p>
+      <w:pPr>
+        <w:pStyle w:val="ListParagraph"/>
+        <w:numPr>
+          <w:ilvl w:val="0"/>
+          <w:numId w:val="1"/>
+        </w:numPr>
+        <w:spacing w:after="60"/>
+      </w:pPr>
+      <w:r>
+        <w:t xml:space="preserve">Faire auditer un domaine par une personne qui n'en est pas responsable.</w:t>
+      </w:r>
+    </w:p>
+    <w:p>
+      <w:pPr>
+        <w:pStyle w:val="ListParagraph"/>
+        <w:numPr>
+          <w:ilvl w:val="0"/>
+          <w:numId w:val="1"/>
+        </w:numPr>
+        <w:spacing w:after="60"/>
+      </w:pPr>
+      <w:r>
+        <w:t xml:space="preserve">Consigner les écarts trouvés et les corriger.</w:t>
+      </w:r>
+    </w:p>
+    <w:p>
+      <w:pPr>
+        <w:spacing w:after="120"/>
+      </w:pPr>
+      <w:r>
+        <w:rPr>
+          <w:b/>
+          <w:bCs/>
+        </w:rPr>
+        <w:t xml:space="preserve">Prochaine étape :</w:t>
+      </w:r>
+      <w:r>
+        <w:t xml:space="preserve"> réaliser un premier audit interne avant de contacter un certificateur. Si l'indépendance est difficile en interne, prévoir un auditeur externe.</w:t>
       </w:r>
     </w:p>
     <w:p>

</xml_diff>